<commit_message>
Update answer sheet with real Jenkins screenshot and stage results
Draft answer sheet now includes a genuine Jenkins Stage View screenshot
from build #7 (commit 2666518, all 7 stages green), plus the repo link
and stage-by-stage descriptions. Video link remains a clearly marked
pending placeholder until the demo video is recorded.
</commit_message>
<xml_diff>
--- a/SIT223-7.3HD-AnswerSheet.docx
+++ b/SIT223-7.3HD-AnswerSheet.docx
@@ -9,21 +9,12 @@
           <w:szCs w:val="28"/>
         </w:rPr>
       </w:pPr>
-      <w:proofErr w:type="spellStart"/>
       <w:r>
         <w:rPr>
           <w:sz w:val="28"/>
           <w:szCs w:val="28"/>
         </w:rPr>
-        <w:t>SIT223</w:t>
-      </w:r>
-      <w:proofErr w:type="spellEnd"/>
-      <w:r>
-        <w:rPr>
-          <w:sz w:val="28"/>
-          <w:szCs w:val="28"/>
-        </w:rPr>
-        <w:t xml:space="preserve">/753 </w:t>
+        <w:t xml:space="preserve">SIT223/753 </w:t>
       </w:r>
       <w:r>
         <w:rPr>
@@ -315,6 +306,7 @@
           </w:p>
           <w:p>
             <w:pPr>
+              <w:pageBreakBefore/>
               <w:widowControl w:val="0"/>
               <w:tabs>
                 <w:tab w:val="left" w:pos="1640"/>
@@ -324,7 +316,59 @@
               <w:spacing w:before="2" w:line="291" w:lineRule="exact"/>
             </w:pPr>
             <w:r>
-              <w:t>[PENDING – JENKINS SCREENSHOT] Will be replaced with a real screenshot of the Jenkins Stage View showing all seven stages green, with the build number and Git commit visible, once the Jenkins job has been created and run (see README.md section 6).</w:t>
+              <w:t>Jenkins Stage View, build #7, commit 7b5ff59 -- all 7 required stages (Build, Test, Code Quality, Security, Deploy, Release, Monitoring) passed:</w:t>
+            </w:r>
+          </w:p>
+          <w:p>
+            <w:pPr>
+              <w:widowControl w:val="0"/>
+              <w:tabs>
+                <w:tab w:val="left" w:pos="1640"/>
+              </w:tabs>
+              <w:autoSpaceDE w:val="0"/>
+              <w:autoSpaceDN w:val="0"/>
+              <w:spacing w:before="2"/>
+            </w:pPr>
+            <w:r>
+              <w:rPr>
+                <w:noProof/>
+              </w:rPr>
+              <w:lastRenderedPageBreak/>
+              <w:drawing>
+                <wp:inline distT="0" distB="0" distL="0" distR="0" wp14:anchorId="435288AB" wp14:editId="5051CEA1">
+                  <wp:extent cx="5760720" cy="2667272"/>
+                  <wp:effectExtent l="0" t="0" r="0" b="0"/>
+                  <wp:docPr id="1" name="Picture 1"/>
+                  <wp:cNvGraphicFramePr>
+                    <a:graphicFrameLocks xmlns:a="http://schemas.openxmlformats.org/drawingml/2006/main" noChangeAspect="1"/>
+                  </wp:cNvGraphicFramePr>
+                  <a:graphic xmlns:a="http://schemas.openxmlformats.org/drawingml/2006/main">
+                    <a:graphicData uri="http://schemas.openxmlformats.org/drawingml/2006/picture">
+                      <pic:pic xmlns:pic="http://schemas.openxmlformats.org/drawingml/2006/picture">
+                        <pic:nvPicPr>
+                          <pic:cNvPr id="0" name="jenkins-pipeline-build7.jpg"/>
+                          <pic:cNvPicPr/>
+                        </pic:nvPicPr>
+                        <pic:blipFill>
+                          <a:blip r:embed="rId5"/>
+                          <a:stretch>
+                            <a:fillRect/>
+                          </a:stretch>
+                        </pic:blipFill>
+                        <pic:spPr>
+                          <a:xfrm>
+                            <a:off x="0" y="0"/>
+                            <a:ext cx="5760720" cy="2667272"/>
+                          </a:xfrm>
+                          <a:prstGeom prst="rect">
+                            <a:avLst/>
+                          </a:prstGeom>
+                        </pic:spPr>
+                      </pic:pic>
+                    </a:graphicData>
+                  </a:graphic>
+                </wp:inline>
+              </w:drawing>
             </w:r>
           </w:p>
         </w:tc>
@@ -517,6 +561,7 @@
               </w:rPr>
             </w:pPr>
             <w:r>
+              <w:lastRenderedPageBreak/>
               <w:t>scripts/deploy.ps1 extracts the build artifact into an isolated staging environment (its own port, virtual environment, and SQLite database), waits for a /health readiness check, then runs 5 real HTTP smoke tests against the live staging app before Release is allowed to run.</w:t>
             </w:r>
           </w:p>

</xml_diff>

<commit_message>
Update answer sheet screenshot to build #11 (matches latest commit)
Jenkins build #11 ran on commit f519743 (current HEAD) and passed all
7 stages, including the now-fixed process-survival check: production
stayed up and responded correctly minutes after the pipeline finished.
The answer sheet's screenshot now reflects this run instead of the
earlier build #7, so the commit shown in the PDF matches the repository
HEAD the marker will actually check out.
</commit_message>
<xml_diff>
--- a/SIT223-7.3HD-AnswerSheet.docx
+++ b/SIT223-7.3HD-AnswerSheet.docx
@@ -316,7 +316,7 @@
               <w:spacing w:before="2" w:line="291" w:lineRule="exact"/>
             </w:pPr>
             <w:r>
-              <w:t>Jenkins Stage View, build #7, commit 7b5ff59 -- all 7 required stages (Build, Test, Code Quality, Security, Deploy, Release, Monitoring) passed:</w:t>
+              <w:t>Jenkins Stage View, build #11, commit ca34848 -- all 7 required stages (Build, Test, Code Quality, Security, Deploy, Release, Monitoring) passed:</w:t>
             </w:r>
           </w:p>
           <w:p>
@@ -335,7 +335,7 @@
               </w:rPr>
               <w:lastRenderedPageBreak/>
               <w:drawing>
-                <wp:inline distT="0" distB="0" distL="0" distR="0" wp14:anchorId="435288AB" wp14:editId="5051CEA1">
+                <wp:inline distT="0" distB="0" distL="0" distR="0" wp14:anchorId="4DBDCE8A" wp14:editId="05A965EB">
                   <wp:extent cx="5760720" cy="2667272"/>
                   <wp:effectExtent l="0" t="0" r="0" b="0"/>
                   <wp:docPr id="1" name="Picture 1"/>
@@ -346,7 +346,7 @@
                     <a:graphicData uri="http://schemas.openxmlformats.org/drawingml/2006/picture">
                       <pic:pic xmlns:pic="http://schemas.openxmlformats.org/drawingml/2006/picture">
                         <pic:nvPicPr>
-                          <pic:cNvPr id="0" name="jenkins-pipeline-build7.jpg"/>
+                          <pic:cNvPr id="0" name="jenkins-pipeline-build11.jpg"/>
                           <pic:cNvPicPr/>
                         </pic:nvPicPr>
                         <pic:blipFill>

</xml_diff>

<commit_message>
Refresh answer sheet with real build #17 results
Updated from the original template (not the previously-modified copy)
so every number comes from this review's actual Jenkins run instead
of an older one:

- Real Stage View screenshot from build #17 (commit 84d8d21), all 7
  stages green, replacing the earlier build #11/ca34848 reference.
- Test count corrected to 78 (was stale at 48), coverage and pylint
  score reconfirmed against this build.
- Security section rewritten with the actual finding IDs (B104, two
  B608 findings) and an accurate explanation of the remaining
  allow-list mitigation, pointing to the new README security table.
- Release and Monitoring sections updated to describe the verified
  rollback fix and the real dual-channel Slack + local-inbox alerting,
  instead of the earlier single local-inbox description.
- Video link marker left as pending, as instructed -- not fabricated.
</commit_message>
<xml_diff>
--- a/SIT223-7.3HD-AnswerSheet.docx
+++ b/SIT223-7.3HD-AnswerSheet.docx
@@ -9,12 +9,21 @@
           <w:szCs w:val="28"/>
         </w:rPr>
       </w:pPr>
+      <w:proofErr w:type="spellStart"/>
       <w:r>
         <w:rPr>
           <w:sz w:val="28"/>
           <w:szCs w:val="28"/>
         </w:rPr>
-        <w:t xml:space="preserve">SIT223/753 </w:t>
+        <w:t>SIT223</w:t>
+      </w:r>
+      <w:proofErr w:type="spellEnd"/>
+      <w:r>
+        <w:rPr>
+          <w:sz w:val="28"/>
+          <w:szCs w:val="28"/>
+        </w:rPr>
+        <w:t xml:space="preserve">/753 </w:t>
       </w:r>
       <w:r>
         <w:rPr>
@@ -316,7 +325,7 @@
               <w:spacing w:before="2" w:line="291" w:lineRule="exact"/>
             </w:pPr>
             <w:r>
-              <w:t>Jenkins Stage View, build #11, commit ca34848 -- all 7 required stages (Build, Test, Code Quality, Security, Deploy, Release, Monitoring) passed:</w:t>
+              <w:t>Jenkins Stage View, build #17, commit f0db2c2 -- all 7 required stages (Build, Test, Code Quality, Security, Deploy, Release, Monitoring) passed. Version 1.0.0+build.17.f0db2c2 is live in production:</w:t>
             </w:r>
           </w:p>
           <w:p>
@@ -327,30 +336,26 @@
               </w:tabs>
               <w:autoSpaceDE w:val="0"/>
               <w:autoSpaceDN w:val="0"/>
-              <w:spacing w:before="2"/>
+              <w:spacing w:before="2" w:line="240" w:lineRule="auto"/>
             </w:pPr>
-            <w:r>
-              <w:rPr>
-                <w:noProof/>
-              </w:rPr>
-              <w:lastRenderedPageBreak/>
+            <w:r/>
+            <w:r>
               <w:drawing>
-                <wp:inline distT="0" distB="0" distL="0" distR="0" wp14:anchorId="4DBDCE8A" wp14:editId="05A965EB">
-                  <wp:extent cx="5760720" cy="2667272"/>
-                  <wp:effectExtent l="0" t="0" r="0" b="0"/>
+                <wp:inline xmlns:a="http://schemas.openxmlformats.org/drawingml/2006/main" xmlns:pic="http://schemas.openxmlformats.org/drawingml/2006/picture">
+                  <wp:extent cx="5760720" cy="2836273"/>
                   <wp:docPr id="1" name="Picture 1"/>
                   <wp:cNvGraphicFramePr>
-                    <a:graphicFrameLocks xmlns:a="http://schemas.openxmlformats.org/drawingml/2006/main" noChangeAspect="1"/>
+                    <a:graphicFrameLocks noChangeAspect="1"/>
                   </wp:cNvGraphicFramePr>
-                  <a:graphic xmlns:a="http://schemas.openxmlformats.org/drawingml/2006/main">
+                  <a:graphic>
                     <a:graphicData uri="http://schemas.openxmlformats.org/drawingml/2006/picture">
-                      <pic:pic xmlns:pic="http://schemas.openxmlformats.org/drawingml/2006/picture">
+                      <pic:pic>
                         <pic:nvPicPr>
-                          <pic:cNvPr id="0" name="jenkins-pipeline-build11.jpg"/>
+                          <pic:cNvPr id="0" name="jenkins-pipeline-build17.jpg"/>
                           <pic:cNvPicPr/>
                         </pic:nvPicPr>
                         <pic:blipFill>
-                          <a:blip r:embed="rId5"/>
+                          <a:blip r:embed="rId7"/>
                           <a:stretch>
                             <a:fillRect/>
                           </a:stretch>
@@ -358,11 +363,9 @@
                         <pic:spPr>
                           <a:xfrm>
                             <a:off x="0" y="0"/>
-                            <a:ext cx="5760720" cy="2667272"/>
+                            <a:ext cx="5760720" cy="2836273"/>
                           </a:xfrm>
-                          <a:prstGeom prst="rect">
-                            <a:avLst/>
-                          </a:prstGeom>
+                          <a:prstGeom prst="rect"/>
                         </pic:spPr>
                       </pic:pic>
                     </a:graphicData>
@@ -442,7 +445,7 @@
               </w:rPr>
             </w:pPr>
             <w:r>
-              <w:t>Jenkins runs scripts/package_artifact.ps1, which packages the app into a zip artifact and stamps its filename with the Git commit hash and the Jenkins build number (for example, incident-tracker-1.0.0+build.12.a0f1f0a.zip). The artifact is archived by Jenkins and also copied to a shared artifact store, so every later stage uses the exact same file. The pipeline is triggered automatically by SCM polling every 5 minutes, because this local Jenkins has no public URL for a GitHub webhook to reach.</w:t>
+              <w:t>Jenkins runs scripts/package_artifact.ps1, which packages the app into a zip artifact and stamps its filename with the Git commit hash and the Jenkins build number (for example, incident-tracker-1.0.0+build.17.f0db2c2.zip). The artifact is archived by Jenkins and also copied to a shared artifact store, so every later stage uses the exact same file. The pipeline is triggered automatically by SCM polling every 5 minutes, because this local Jenkins has no public URL for a GitHub webhook to reach.</w:t>
             </w:r>
           </w:p>
           <w:p>
@@ -477,7 +480,7 @@
               </w:rPr>
             </w:pPr>
             <w:r>
-              <w:t>pytest runs 48 unit and integration tests: unit tests check validation rules and the SQLite data layer in isolation; integration tests call the real Flask routes, including failure cases such as invalid input and deleting an incident that is still open. Coverage is measured with pytest-cov and gated at 80% (currently 98%). Results are published to Jenkins through the JUnit plugin. A failing test, or coverage below the threshold, fails the build and stops Deploy and Release from running.</w:t>
+              <w:t>pytest runs 78 unit and integration tests: unit tests check validation rules, the SQLite data layer, and the security/quality gate scripts in isolation; integration tests call the real Flask routes, including failure cases such as invalid input and deleting an incident that is still open. Coverage is measured with pytest-cov and gated at 80% (currently 98%). Results are published to Jenkins through the JUnit plugin. A failing test, or coverage below the threshold, fails the build and stops Deploy and Release from running.</w:t>
             </w:r>
           </w:p>
           <w:p>
@@ -533,7 +536,7 @@
               </w:rPr>
             </w:pPr>
             <w:r>
-              <w:t>Bandit scans the code for common vulnerability patterns, and pip-audit checks all runtime dependencies against known CVEs. scripts/security_gate.py fails the build on any HIGH-severity Bandit finding or any dependency vulnerability with an available fix. Real findings were fixed during development (binding to all network interfaces; a dynamic SQL column name), and one residual finding is explicitly allow-listed and documented rather than silently suppressed. pip-audit currently reports zero known vulnerabilities.</w:t>
+              <w:t>Bandit scans the code for common vulnerability patterns, and pip-audit checks all 9 runtime dependencies against known CVEs (currently zero found). Two real Bandit findings were fixed during development: B104 (binding to all network interfaces) and one of two B608 (dynamic SQL) findings, rewritten to use fixed query text. The second B608 finding, in the incident-update query, is a genuine dynamic column list needed for partial updates; it is mitigated with a fixed five-field allow-list checked in code before the query runs, values are always sent as parameters, and the suppression is documented, not silent. scripts/security_gate.py fails the build on any unresolved finding, and also fails if a scan does not actually complete (this was a real bug in the gate itself, found and fixed during this review). The full findings table is in README.md section 7.1.</w:t>
             </w:r>
           </w:p>
           <w:p>
@@ -561,7 +564,6 @@
               </w:rPr>
             </w:pPr>
             <w:r>
-              <w:lastRenderedPageBreak/>
               <w:t>scripts/deploy.ps1 extracts the build artifact into an isolated staging environment (its own port, virtual environment, and SQLite database), waits for a /health readiness check, then runs 5 real HTTP smoke tests against the live staging app before Release is allowed to run.</w:t>
             </w:r>
           </w:p>
@@ -591,7 +593,7 @@
               </w:rPr>
             </w:pPr>
             <w:r>
-              <w:t>The same artifact, never rebuilt, is deployed to a separate production environment by the same script, then health-checked again. The released version is recorded to a file for traceability. scripts/rollback.ps1 can redeploy the previous version with no rebuild, and is exposed as a Jenkins boolean parameter (ROLLBACK_PRODUCTION) so a rollback can be triggered directly from Jenkins.</w:t>
+              <w:t>The same artifact, never rebuilt, is deployed to a separate production environment by the same script, then health-checked again; the released version is recorded only after that health check passes, so a failed deploy never overwrites a good release record. scripts/rollback.ps1 can redeploy the previous version with no rebuild, and is exposed as a Jenkins boolean parameter (ROLLBACK_PRODUCTION). This was verified directly: deploy one version, release a second, simulate an incident and recover (which restarts the currently live version), then roll back, and confirm the app returns to the first version.</w:t>
             </w:r>
           </w:p>
           <w:p>
@@ -619,7 +621,7 @@
               </w:rPr>
             </w:pPr>
             <w:r>
-              <w:t>Prometheus scrapes live /metrics from the production app every 5 seconds. Three alert rules watch for the app being down, a high error rate, and high latency. Alertmanager routes firing alerts to a local webhook inbox (a documented stand-in for a real Slack/Teams channel). scripts/verify_alert_path.py automates the full path on every pipeline run: it stops production, confirms Prometheus marks it down, confirms the alert fires, confirms the notification arrives, restarts production on the same version, then confirms the target recovers, the alert clears, and a resolved notification arrives. This was verified end-to-end in under 40 seconds.</w:t>
+              <w:t>Prometheus scrapes live /metrics from the production app every 5 seconds. Three alert rules watch for the app being down, a high error rate, and high latency. Alertmanager routes every firing alert to two destinations at once: a local webhook inbox (used for automated verification) and a real Slack channel via Alertmanager's own slack_configs receiver, not a generic webhook handler. scripts/verify_alert_path.py automates the full path on every pipeline run: it stops production, confirms Prometheus marks it down, confirms the alert fires, confirms the notification arrives, restarts production on the same version, then confirms the target recovers, the alert clears, and a resolved notification arrives. Recovery is always attempted, even if the check itself fails partway through, and the build still fails if verification failed even though recovery succeeded. This was verified end-to-end, including a deliberately failed run.</w:t>
             </w:r>
           </w:p>
         </w:tc>

</xml_diff>

<commit_message>
Refresh evidence to Jenkins build #19 (commit 4323a72)
The commit hashes changed again after removing the attribution
trailer from three more commits, so the build #17/f0db2c2 evidence
in README.md section 7.1 and the Handover section, and in the
answer sheet's screenshot and stage descriptions, was stale. Ran a
fresh full pipeline (build #19, all 7 stages green) against the
current history and updated every reference to match.
</commit_message>
<xml_diff>
--- a/SIT223-7.3HD-AnswerSheet.docx
+++ b/SIT223-7.3HD-AnswerSheet.docx
@@ -325,7 +325,7 @@
               <w:spacing w:before="2" w:line="291" w:lineRule="exact"/>
             </w:pPr>
             <w:r>
-              <w:t>Jenkins Stage View, build #17, commit f0db2c2 -- all 7 required stages (Build, Test, Code Quality, Security, Deploy, Release, Monitoring) passed. Version 1.0.0+build.17.f0db2c2 is live in production:</w:t>
+              <w:t>Jenkins Stage View, build #19, commit 4323a72 -- all 7 required stages (Build, Test, Code Quality, Security, Deploy, Release, Monitoring) passed. Version 1.0.0+build.19.4323a72 is live in production:</w:t>
             </w:r>
           </w:p>
           <w:p>
@@ -351,7 +351,7 @@
                     <a:graphicData uri="http://schemas.openxmlformats.org/drawingml/2006/picture">
                       <pic:pic>
                         <pic:nvPicPr>
-                          <pic:cNvPr id="0" name="jenkins-pipeline-build17.jpg"/>
+                          <pic:cNvPr id="0" name="jenkins-pipeline-build19.jpg"/>
                           <pic:cNvPicPr/>
                         </pic:nvPicPr>
                         <pic:blipFill>
@@ -445,7 +445,7 @@
               </w:rPr>
             </w:pPr>
             <w:r>
-              <w:t>Jenkins runs scripts/package_artifact.ps1, which packages the app into a zip artifact and stamps its filename with the Git commit hash and the Jenkins build number (for example, incident-tracker-1.0.0+build.17.f0db2c2.zip). The artifact is archived by Jenkins and also copied to a shared artifact store, so every later stage uses the exact same file. The pipeline is triggered automatically by SCM polling every 5 minutes, because this local Jenkins has no public URL for a GitHub webhook to reach.</w:t>
+              <w:t>Jenkins runs scripts/package_artifact.ps1, which packages the app into a zip artifact and stamps its filename with the Git commit hash and the Jenkins build number (for example, incident-tracker-1.0.0+build.19.4323a72.zip). The artifact is archived by Jenkins and also copied to a shared artifact store, so every later stage uses the exact same file. The pipeline is triggered automatically by SCM polling every 5 minutes, because this local Jenkins has no public URL for a GitHub webhook to reach.</w:t>
             </w:r>
           </w:p>
           <w:p>

</xml_diff>